<commit_message>
second update _add link github and edit readme
</commit_message>
<xml_diff>
--- a/Lab1_DE190324_NguyenVanDang.docx
+++ b/Lab1_DE190324_NguyenVanDang.docx
@@ -802,10 +802,22 @@
             <w:pPr>
               <w:spacing w:before="20" w:after="20"/>
               <w:rPr>
+                <w:b/>
+                <w:bCs/>
                 <w:sz w:val="21"/>
                 <w:szCs w:val="21"/>
               </w:rPr>
             </w:pPr>
+            <w:r>
+              <w:rPr>
+                <w:rFonts w:hint="default"/>
+                <w:b/>
+                <w:bCs/>
+                <w:sz w:val="21"/>
+                <w:szCs w:val="21"/>
+              </w:rPr>
+              <w:t>https://github.com/Nguyendang2005/Lab1_SWT301_NguyenDang</w:t>
+            </w:r>
           </w:p>
         </w:tc>
       </w:tr>
@@ -963,6 +975,8 @@
           <w:lang w:val="en-US"/>
         </w:rPr>
       </w:pPr>
+      <w:bookmarkStart w:id="0" w:name="_GoBack"/>
+      <w:bookmarkEnd w:id="0"/>
     </w:p>
     <w:p>
       <w:pPr>
@@ -2538,15 +2552,6 @@
       </w:tblGrid>
       <w:tr>
         <w:tblPrEx>
-          <w:tblBorders>
-            <w:top w:val="single" w:color="auto" w:sz="4" w:space="0"/>
-            <w:left w:val="single" w:color="auto" w:sz="4" w:space="0"/>
-            <w:bottom w:val="single" w:color="auto" w:sz="4" w:space="0"/>
-            <w:right w:val="single" w:color="auto" w:sz="4" w:space="0"/>
-            <w:insideH w:val="single" w:color="auto" w:sz="4" w:space="0"/>
-            <w:insideV w:val="single" w:color="auto" w:sz="4" w:space="0"/>
-          </w:tblBorders>
-          <w:shd w:val="clear"/>
           <w:tblCellMar>
             <w:top w:w="15" w:type="dxa"/>
             <w:left w:w="15" w:type="dxa"/>
@@ -3400,7 +3405,6 @@
             <w:insideH w:val="single" w:color="auto" w:sz="4" w:space="0"/>
             <w:insideV w:val="single" w:color="auto" w:sz="4" w:space="0"/>
           </w:tblBorders>
-          <w:shd w:val="clear"/>
           <w:tblCellMar>
             <w:top w:w="15" w:type="dxa"/>
             <w:left w:w="15" w:type="dxa"/>
@@ -3517,6 +3521,7 @@
             <w:insideH w:val="single" w:color="auto" w:sz="4" w:space="0"/>
             <w:insideV w:val="single" w:color="auto" w:sz="4" w:space="0"/>
           </w:tblBorders>
+          <w:shd w:val="clear"/>
           <w:tblCellMar>
             <w:top w:w="15" w:type="dxa"/>
             <w:left w:w="15" w:type="dxa"/>
@@ -3624,6 +3629,7 @@
             <w:insideH w:val="single" w:color="auto" w:sz="4" w:space="0"/>
             <w:insideV w:val="single" w:color="auto" w:sz="4" w:space="0"/>
           </w:tblBorders>
+          <w:shd w:val="clear"/>
           <w:tblCellMar>
             <w:top w:w="15" w:type="dxa"/>
             <w:left w:w="15" w:type="dxa"/>
@@ -3839,7 +3845,6 @@
             <w:insideH w:val="single" w:color="auto" w:sz="4" w:space="0"/>
             <w:insideV w:val="single" w:color="auto" w:sz="4" w:space="0"/>
           </w:tblBorders>
-          <w:shd w:val="clear"/>
           <w:tblCellMar>
             <w:top w:w="15" w:type="dxa"/>
             <w:left w:w="15" w:type="dxa"/>
@@ -3947,7 +3952,6 @@
             <w:insideH w:val="single" w:color="auto" w:sz="4" w:space="0"/>
             <w:insideV w:val="single" w:color="auto" w:sz="4" w:space="0"/>
           </w:tblBorders>
-          <w:shd w:val="clear"/>
           <w:tblCellMar>
             <w:top w:w="15" w:type="dxa"/>
             <w:left w:w="15" w:type="dxa"/>
@@ -6058,6 +6062,7 @@
             <w:insideH w:val="none" w:color="auto" w:sz="0" w:space="0"/>
             <w:insideV w:val="none" w:color="auto" w:sz="0" w:space="0"/>
           </w:tblBorders>
+          <w:shd w:val="clear"/>
           <w:tblCellMar>
             <w:top w:w="15" w:type="dxa"/>
             <w:left w:w="15" w:type="dxa"/>
@@ -6221,6 +6226,7 @@
             <w:insideH w:val="none" w:color="auto" w:sz="0" w:space="0"/>
             <w:insideV w:val="none" w:color="auto" w:sz="0" w:space="0"/>
           </w:tblBorders>
+          <w:shd w:val="clear"/>
           <w:tblCellMar>
             <w:top w:w="15" w:type="dxa"/>
             <w:left w:w="15" w:type="dxa"/>
@@ -10641,7 +10647,6 @@
             <w:insideH w:val="none" w:color="auto" w:sz="0" w:space="0"/>
             <w:insideV w:val="none" w:color="auto" w:sz="0" w:space="0"/>
           </w:tblBorders>
-          <w:shd w:val="clear"/>
           <w:tblCellMar>
             <w:top w:w="15" w:type="dxa"/>
             <w:left w:w="15" w:type="dxa"/>
@@ -10749,7 +10754,6 @@
             <w:insideH w:val="none" w:color="auto" w:sz="0" w:space="0"/>
             <w:insideV w:val="none" w:color="auto" w:sz="0" w:space="0"/>
           </w:tblBorders>
-          <w:shd w:val="clear"/>
           <w:tblCellMar>
             <w:top w:w="15" w:type="dxa"/>
             <w:left w:w="15" w:type="dxa"/>
@@ -10857,7 +10861,6 @@
             <w:insideH w:val="none" w:color="auto" w:sz="0" w:space="0"/>
             <w:insideV w:val="none" w:color="auto" w:sz="0" w:space="0"/>
           </w:tblBorders>
-          <w:shd w:val="clear"/>
           <w:tblCellMar>
             <w:top w:w="15" w:type="dxa"/>
             <w:left w:w="15" w:type="dxa"/>
@@ -10965,7 +10968,6 @@
             <w:insideH w:val="none" w:color="auto" w:sz="0" w:space="0"/>
             <w:insideV w:val="none" w:color="auto" w:sz="0" w:space="0"/>
           </w:tblBorders>
-          <w:shd w:val="clear"/>
           <w:tblCellMar>
             <w:top w:w="15" w:type="dxa"/>
             <w:left w:w="15" w:type="dxa"/>
@@ -11073,7 +11075,6 @@
             <w:insideH w:val="none" w:color="auto" w:sz="0" w:space="0"/>
             <w:insideV w:val="none" w:color="auto" w:sz="0" w:space="0"/>
           </w:tblBorders>
-          <w:shd w:val="clear"/>
           <w:tblCellMar>
             <w:top w:w="15" w:type="dxa"/>
             <w:left w:w="15" w:type="dxa"/>
@@ -11619,8 +11620,6 @@
         </w:rPr>
         <w:t xml:space="preserve"> </w:t>
       </w:r>
-      <w:bookmarkStart w:id="0" w:name="_GoBack"/>
-      <w:bookmarkEnd w:id="0"/>
     </w:p>
     <w:p>
       <w:pPr>

</xml_diff>